<commit_message>
Update auf Version 1.4.1
</commit_message>
<xml_diff>
--- a/honorar_vorlage.docx
+++ b/honorar_vorlage.docx
@@ -4,86 +4,106 @@
   <w:body>
     <w:p>
       <w:pPr>
+        <w:spacing w:after="0"/>
+        <w:jc w:val="right"/>
+      </w:pPr>
+      <w:r>
+        <w:t>{{Rechnungsnummer}}</w:t>
+      </w:r>
+    </w:p>
+    <w:p>
+      <w:pPr>
+        <w:spacing w:after="0"/>
+      </w:pPr>
+    </w:p>
+    <w:p>
+      <w:pPr>
+        <w:spacing w:after="0"/>
+      </w:pPr>
+    </w:p>
+    <w:p>
+      <w:pPr>
+        <w:spacing w:after="0"/>
+      </w:pPr>
+      <w:r>
+        <w:t>{{Anrede}}</w:t>
+      </w:r>
+    </w:p>
+    <w:p>
+      <w:pPr>
+        <w:spacing w:after="0"/>
+      </w:pPr>
+      <w:r>
+        <w:t>{{Nachname}} {{Vorname}}</w:t>
+      </w:r>
+    </w:p>
+    <w:p>
+      <w:pPr>
+        <w:spacing w:after="0"/>
+      </w:pPr>
+      <w:r>
+        <w:t>{{Straße}} {{Hausnummer}} {{Adresszusatz}}</w:t>
+      </w:r>
+    </w:p>
+    <w:p>
+      <w:pPr>
+        <w:spacing w:after="0"/>
+      </w:pPr>
+      <w:r>
+        <w:t>{{Postleitzahl}}</w:t>
+      </w:r>
+      <w:r>
+        <w:t xml:space="preserve"> </w:t>
+      </w:r>
+      <w:r>
+        <w:t>{{Stadt}}</w:t>
+      </w:r>
+      <w:r>
+        <w:br/>
+      </w:r>
+    </w:p>
+    <w:p>
+      <w:pPr>
+        <w:spacing w:after="0"/>
+      </w:pPr>
+      <w:proofErr w:type="spellStart"/>
+      <w:r>
+        <w:t>Versnr</w:t>
+      </w:r>
+      <w:proofErr w:type="spellEnd"/>
+      <w:r>
+        <w:t xml:space="preserve">.: </w:t>
+      </w:r>
+      <w:r>
+        <w:t>{{Versicherungsnummer}}</w:t>
+      </w:r>
+    </w:p>
+    <w:p>
+      <w:pPr>
+        <w:spacing w:after="0"/>
+      </w:pPr>
+    </w:p>
+    <w:p>
+      <w:pPr>
         <w:ind w:right="-285"/>
         <w:jc w:val="right"/>
       </w:pPr>
       <w:r>
-        <w:t xml:space="preserve"> </w:t>
-      </w:r>
-      <w:r>
-        <w:t>{HONORAR_NR}</w:t>
-      </w:r>
-    </w:p>
-    <w:p>
-      <w:pPr>
-        <w:spacing w:after="0"/>
-      </w:pPr>
-      <w:r>
-        <w:t>{{Anrede}}</w:t>
-      </w:r>
-    </w:p>
-    <w:p>
-      <w:pPr>
-        <w:spacing w:after="0"/>
-      </w:pPr>
-      <w:r>
-        <w:t>{{Nachname}} {{Vorname}}</w:t>
-      </w:r>
-    </w:p>
-    <w:p>
-      <w:pPr>
-        <w:spacing w:after="0"/>
-      </w:pPr>
-      <w:r>
-        <w:t>{{Straße}} {{Hausnummer}} {{Adresszusatz}}</w:t>
-      </w:r>
-    </w:p>
-    <w:p>
-      <w:pPr>
-        <w:spacing w:after="0"/>
-      </w:pPr>
-      <w:r>
-        <w:t>{{Postleitzahl}}</w:t>
-      </w:r>
-      <w:r>
-        <w:t xml:space="preserve"> </w:t>
-      </w:r>
-      <w:r>
-        <w:t>{{Stadt}}</w:t>
-      </w:r>
-      <w:r>
-        <w:br/>
-      </w:r>
-    </w:p>
-    <w:p>
-      <w:pPr>
-        <w:spacing w:after="0"/>
-      </w:pPr>
-      <w:r>
-        <w:t xml:space="preserve">Versnr.: </w:t>
-      </w:r>
-      <w:r>
-        <w:t>{{Versicherungsnummer}}</w:t>
-      </w:r>
-    </w:p>
-    <w:p>
-      <w:pPr>
-        <w:spacing w:after="0"/>
-      </w:pPr>
-    </w:p>
-    <w:p>
-      <w:pPr>
-        <w:ind w:right="-285"/>
-        <w:jc w:val="right"/>
-      </w:pPr>
-      <w:r>
         <w:t xml:space="preserve">Mödling, </w:t>
       </w:r>
       <w:r>
         <w:t>{</w:t>
       </w:r>
       <w:r>
-        <w:t>{Datum_Austellung}}</w:t>
+        <w:t>{</w:t>
+      </w:r>
+      <w:proofErr w:type="spellStart"/>
+      <w:r>
+        <w:t>Datum_Austellung</w:t>
+      </w:r>
+      <w:proofErr w:type="spellEnd"/>
+      <w:r>
+        <w:t>}}</w:t>
       </w:r>
       <w:r>
         <w:br/>
@@ -162,7 +182,16 @@
           <w:sz w:val="24"/>
           <w:szCs w:val="24"/>
         </w:rPr>
-        <w:t>gnose:</w:t>
+        <w:t>gnose</w:t>
+      </w:r>
+      <w:proofErr w:type="gramStart"/>
+      <w:r>
+        <w:rPr>
+          <w:b/>
+          <w:sz w:val="24"/>
+          <w:szCs w:val="24"/>
+        </w:rPr>
+        <w:t>:</w:t>
       </w:r>
       <w:r>
         <w:rPr>
@@ -176,7 +205,22 @@
           <w:sz w:val="24"/>
           <w:szCs w:val="24"/>
         </w:rPr>
-        <w:t>{{Diagnose}}</w:t>
+        <w:t xml:space="preserve"> </w:t>
+      </w:r>
+      <w:r>
+        <w:rPr>
+          <w:sz w:val="24"/>
+          <w:szCs w:val="24"/>
+        </w:rPr>
+        <w:t>{</w:t>
+      </w:r>
+      <w:proofErr w:type="gramEnd"/>
+      <w:r>
+        <w:rPr>
+          <w:sz w:val="24"/>
+          <w:szCs w:val="24"/>
+        </w:rPr>
+        <w:t>{Diagnose}}</w:t>
       </w:r>
     </w:p>
     <w:p>
@@ -419,6 +463,7 @@
         </w:rPr>
         <w:t>{{</w:t>
       </w:r>
+      <w:proofErr w:type="spellStart"/>
       <w:proofErr w:type="gramStart"/>
       <w:r>
         <w:rPr>
@@ -437,7 +482,17 @@
           <w:szCs w:val="24"/>
           <w:u w:val="double"/>
         </w:rPr>
-        <w:t>_Betrag}}</w:t>
+        <w:t>_Betrag</w:t>
+      </w:r>
+      <w:proofErr w:type="spellEnd"/>
+      <w:r>
+        <w:rPr>
+          <w:b/>
+          <w:sz w:val="24"/>
+          <w:szCs w:val="24"/>
+          <w:u w:val="double"/>
+        </w:rPr>
+        <w:t>}}</w:t>
       </w:r>
     </w:p>
     <w:p>
@@ -791,6 +846,7 @@
                     <w:lang w:val="de-DE"/>
                   </w:rPr>
                 </w:pPr>
+                <w:proofErr w:type="spellStart"/>
                 <w:r>
                   <w:rPr>
                     <w:rFonts w:ascii="Arial" w:hAnsi="Arial" w:cs="Arial"/>
@@ -800,7 +856,19 @@
                     <w:szCs w:val="24"/>
                     <w:lang w:val="de-DE"/>
                   </w:rPr>
-                  <w:t>Triesterstraße 10/4/3/1</w:t>
+                  <w:t>Triesterstraße</w:t>
+                </w:r>
+                <w:proofErr w:type="spellEnd"/>
+                <w:r>
+                  <w:rPr>
+                    <w:rFonts w:ascii="Arial" w:hAnsi="Arial" w:cs="Arial"/>
+                    <w:b/>
+                    <w:color w:val="3D6B95"/>
+                    <w:sz w:val="24"/>
+                    <w:szCs w:val="24"/>
+                    <w:lang w:val="de-DE"/>
+                  </w:rPr>
+                  <w:t xml:space="preserve"> 10/4/3/1</w:t>
                 </w:r>
                 <w:r>
                   <w:rPr>

</xml_diff>